<commit_message>
Fix RUT and tipo for docx generation
</commit_message>
<xml_diff>
--- a/public/acta_asigna.docx
+++ b/public/acta_asigna.docx
@@ -75,15 +75,7 @@
                 <w:rStyle w:val="Normal1"/>
                 <w:rFonts w:ascii="Aptos Display" w:hAnsi="Aptos Display"/>
               </w:rPr>
-              <w:t>{</w:t>
-            </w:r>
-            <w:proofErr w:type="spellStart"/>
-            <w:r>
-              <w:rPr>
-                <w:rStyle w:val="Normal1"/>
-                <w:rFonts w:ascii="Aptos Display" w:hAnsi="Aptos Display"/>
-              </w:rPr>
-              <w:t>ti_</w:t>
+              <w:t>{ti_</w:t>
             </w:r>
             <w:r>
               <w:rPr>
@@ -92,7 +84,6 @@
               </w:rPr>
               <w:t>rut</w:t>
             </w:r>
-            <w:proofErr w:type="spellEnd"/>
             <w:r>
               <w:rPr>
                 <w:rStyle w:val="Normal1"/>
@@ -120,23 +111,7 @@
                 <w:rStyle w:val="Normal1"/>
                 <w:rFonts w:ascii="Aptos Display" w:hAnsi="Aptos Display"/>
               </w:rPr>
-              <w:t>{</w:t>
-            </w:r>
-            <w:proofErr w:type="spellStart"/>
-            <w:r>
-              <w:rPr>
-                <w:rStyle w:val="Normal1"/>
-                <w:rFonts w:ascii="Aptos Display" w:hAnsi="Aptos Display"/>
-              </w:rPr>
-              <w:t>ti_nombre</w:t>
-            </w:r>
-            <w:proofErr w:type="spellEnd"/>
-            <w:r>
-              <w:rPr>
-                <w:rStyle w:val="Normal1"/>
-                <w:rFonts w:ascii="Aptos Display" w:hAnsi="Aptos Display"/>
-              </w:rPr>
-              <w:t>}</w:t>
+              <w:t>{ti_nombre}</w:t>
             </w:r>
           </w:p>
         </w:tc>
@@ -158,23 +133,7 @@
                 <w:rStyle w:val="Normal1"/>
                 <w:rFonts w:ascii="Aptos Display" w:hAnsi="Aptos Display"/>
               </w:rPr>
-              <w:t>{</w:t>
-            </w:r>
-            <w:proofErr w:type="spellStart"/>
-            <w:r>
-              <w:rPr>
-                <w:rStyle w:val="Normal1"/>
-                <w:rFonts w:ascii="Aptos Display" w:hAnsi="Aptos Display"/>
-              </w:rPr>
-              <w:t>ti_subdireccion</w:t>
-            </w:r>
-            <w:proofErr w:type="spellEnd"/>
-            <w:r>
-              <w:rPr>
-                <w:rStyle w:val="Normal1"/>
-                <w:rFonts w:ascii="Aptos Display" w:hAnsi="Aptos Display"/>
-              </w:rPr>
-              <w:t>}</w:t>
+              <w:t>{ti_subdireccion}</w:t>
             </w:r>
           </w:p>
         </w:tc>
@@ -322,15 +281,7 @@
                 <w:rStyle w:val="Normal1"/>
                 <w:rFonts w:ascii="Aptos Display" w:hAnsi="Aptos Display"/>
               </w:rPr>
-              <w:t>{</w:t>
-            </w:r>
-            <w:proofErr w:type="spellStart"/>
-            <w:r>
-              <w:rPr>
-                <w:rStyle w:val="Normal1"/>
-                <w:rFonts w:ascii="Aptos Display" w:hAnsi="Aptos Display"/>
-              </w:rPr>
-              <w:t>solicitante_</w:t>
+              <w:t>{solicitante_</w:t>
             </w:r>
             <w:r>
               <w:rPr>
@@ -339,7 +290,6 @@
               </w:rPr>
               <w:t>rut</w:t>
             </w:r>
-            <w:proofErr w:type="spellEnd"/>
             <w:r>
               <w:rPr>
                 <w:rStyle w:val="Normal1"/>
@@ -367,23 +317,7 @@
                 <w:rStyle w:val="Normal1"/>
                 <w:rFonts w:ascii="Aptos Display" w:hAnsi="Aptos Display"/>
               </w:rPr>
-              <w:t>{</w:t>
-            </w:r>
-            <w:proofErr w:type="spellStart"/>
-            <w:r>
-              <w:rPr>
-                <w:rStyle w:val="Normal1"/>
-                <w:rFonts w:ascii="Aptos Display" w:hAnsi="Aptos Display"/>
-              </w:rPr>
-              <w:t>solicitante_nombre</w:t>
-            </w:r>
-            <w:proofErr w:type="spellEnd"/>
-            <w:r>
-              <w:rPr>
-                <w:rStyle w:val="Normal1"/>
-                <w:rFonts w:ascii="Aptos Display" w:hAnsi="Aptos Display"/>
-              </w:rPr>
-              <w:t>}</w:t>
+              <w:t>{solicitante_nombre}</w:t>
             </w:r>
           </w:p>
         </w:tc>
@@ -405,23 +339,7 @@
                 <w:rStyle w:val="Normal1"/>
                 <w:rFonts w:ascii="Aptos Display" w:hAnsi="Aptos Display"/>
               </w:rPr>
-              <w:t>{</w:t>
-            </w:r>
-            <w:proofErr w:type="spellStart"/>
-            <w:r>
-              <w:rPr>
-                <w:rStyle w:val="Normal1"/>
-                <w:rFonts w:ascii="Aptos Display" w:hAnsi="Aptos Display"/>
-              </w:rPr>
-              <w:t>solicitante_subdireccion</w:t>
-            </w:r>
-            <w:proofErr w:type="spellEnd"/>
-            <w:r>
-              <w:rPr>
-                <w:rStyle w:val="Normal1"/>
-                <w:rFonts w:ascii="Aptos Display" w:hAnsi="Aptos Display"/>
-              </w:rPr>
-              <w:t>}</w:t>
+              <w:t>{solicitante_subdireccion}</w:t>
             </w:r>
           </w:p>
         </w:tc>
@@ -622,21 +540,12 @@
                 <w:rFonts w:ascii="Aptos Display" w:hAnsi="Aptos Display"/>
               </w:rPr>
             </w:pPr>
-            <w:proofErr w:type="spellStart"/>
             <w:r>
               <w:rPr>
                 <w:rStyle w:val="Normal1"/>
                 <w:rFonts w:ascii="Aptos Display" w:hAnsi="Aptos Display"/>
               </w:rPr>
-              <w:t>N°</w:t>
-            </w:r>
-            <w:proofErr w:type="spellEnd"/>
-            <w:r>
-              <w:rPr>
-                <w:rStyle w:val="Normal1"/>
-                <w:rFonts w:ascii="Aptos Display" w:hAnsi="Aptos Display"/>
-              </w:rPr>
-              <w:t xml:space="preserve"> de serie</w:t>
+              <w:t>N° de serie</w:t>
             </w:r>
           </w:p>
         </w:tc>
@@ -659,23 +568,7 @@
                 <w:rStyle w:val="Normal1"/>
                 <w:rFonts w:ascii="Aptos Display" w:hAnsi="Aptos Display"/>
               </w:rPr>
-              <w:t>{#</w:t>
-            </w:r>
-            <w:proofErr w:type="gramStart"/>
-            <w:r>
-              <w:rPr>
-                <w:rStyle w:val="Normal1"/>
-                <w:rFonts w:ascii="Aptos Display" w:hAnsi="Aptos Display"/>
-              </w:rPr>
-              <w:t>equipos}{</w:t>
-            </w:r>
-            <w:proofErr w:type="gramEnd"/>
-            <w:r>
-              <w:rPr>
-                <w:rStyle w:val="Normal1"/>
-                <w:rFonts w:ascii="Aptos Display" w:hAnsi="Aptos Display"/>
-              </w:rPr>
-              <w:t>tipo}</w:t>
+              <w:t>{#equipos}{tipo}</w:t>
             </w:r>
           </w:p>
         </w:tc>
@@ -696,23 +589,7 @@
                 <w:rStyle w:val="Normal1"/>
                 <w:rFonts w:ascii="Aptos Display" w:hAnsi="Aptos Display"/>
               </w:rPr>
-              <w:t>{</w:t>
-            </w:r>
-            <w:proofErr w:type="spellStart"/>
-            <w:r>
-              <w:rPr>
-                <w:rStyle w:val="Normal1"/>
-                <w:rFonts w:ascii="Aptos Display" w:hAnsi="Aptos Display"/>
-              </w:rPr>
-              <w:t>marca_modelo</w:t>
-            </w:r>
-            <w:proofErr w:type="spellEnd"/>
-            <w:r>
-              <w:rPr>
-                <w:rStyle w:val="Normal1"/>
-                <w:rFonts w:ascii="Aptos Display" w:hAnsi="Aptos Display"/>
-              </w:rPr>
-              <w:t>}</w:t>
+              <w:t>{marca_modelo}</w:t>
             </w:r>
           </w:p>
         </w:tc>
@@ -734,6 +611,12 @@
                 <w:rFonts w:ascii="Aptos Display" w:hAnsi="Aptos Display"/>
               </w:rPr>
               <w:t>{serie}</w:t>
+            </w:r>
+            <w:r>
+              <w:rPr>
+                <w:rFonts w:ascii="Aptos Display" w:hAnsi="Aptos Display"/>
+              </w:rPr>
+              <w:t>{/equipos}</w:t>
             </w:r>
           </w:p>
         </w:tc>
@@ -5569,7 +5452,6 @@
   <w:style w:type="character" w:default="1" w:styleId="Fuentedeprrafopredeter">
     <w:name w:val="Default Paragraph Font"/>
     <w:uiPriority w:val="1"/>
-    <w:semiHidden/>
     <w:unhideWhenUsed/>
   </w:style>
   <w:style w:type="table" w:default="1" w:styleId="Tablanormal">
@@ -6327,6 +6209,27 @@
 </file>
 
 <file path=customXml/item1.xml><?xml version="1.0" encoding="utf-8"?>
+<p:properties xmlns:p="http://schemas.microsoft.com/office/2006/metadata/properties" xmlns:xsi="http://www.w3.org/2001/XMLSchema-instance" xmlns:pc="http://schemas.microsoft.com/office/infopath/2007/PartnerControls">
+  <documentManagement>
+    <_activity xmlns="bcce9e69-2193-489b-8979-bcf4d9513be1" xsi:nil="true"/>
+  </documentManagement>
+</p:properties>
+</file>
+
+<file path=customXml/item2.xml><?xml version="1.0" encoding="utf-8"?>
+<?mso-contentType ?>
+<FormTemplates xmlns="http://schemas.microsoft.com/sharepoint/v3/contenttype/forms">
+  <Display>DocumentLibraryForm</Display>
+  <Edit>DocumentLibraryForm</Edit>
+  <New>DocumentLibraryForm</New>
+</FormTemplates>
+</file>
+
+<file path=customXml/item3.xml><?xml version="1.0" encoding="utf-8"?>
+<b:Sources xmlns:b="http://schemas.openxmlformats.org/officeDocument/2006/bibliography" xmlns="http://schemas.openxmlformats.org/officeDocument/2006/bibliography" SelectedStyle="\APA.XSL" StyleName="APA"/>
+</file>
+
+<file path=customXml/item4.xml><?xml version="1.0" encoding="utf-8"?>
 <ct:contentTypeSchema xmlns:ct="http://schemas.microsoft.com/office/2006/metadata/contentType" xmlns:ma="http://schemas.microsoft.com/office/2006/metadata/properties/metaAttributes" ct:_="" ma:_="" ma:contentTypeName="Document" ma:contentTypeID="0x010100D2977320FF50BE48B7E8EE87EBCF0601" ma:contentTypeVersion="11" ma:contentTypeDescription="Create a new document." ma:contentTypeScope="" ma:versionID="d3e0c027367d740cbf39034df56ffe22">
   <xsd:schema xmlns:xsd="http://www.w3.org/2001/XMLSchema" xmlns:xs="http://www.w3.org/2001/XMLSchema" xmlns:p="http://schemas.microsoft.com/office/2006/metadata/properties" xmlns:ns3="bcce9e69-2193-489b-8979-bcf4d9513be1" targetNamespace="http://schemas.microsoft.com/office/2006/metadata/properties" ma:root="true" ma:fieldsID="28b1c348ba72a3784f3915424c61e130" ns3:_="">
     <xsd:import namespace="bcce9e69-2193-489b-8979-bcf4d9513be1"/>
@@ -6514,28 +6417,33 @@
 </ct:contentTypeSchema>
 </file>
 
-<file path=customXml/item2.xml><?xml version="1.0" encoding="utf-8"?>
-<b:Sources xmlns:b="http://schemas.openxmlformats.org/officeDocument/2006/bibliography" xmlns="http://schemas.openxmlformats.org/officeDocument/2006/bibliography" SelectedStyle="\APA.XSL" StyleName="APA"/>
+<file path=customXml/itemProps1.xml><?xml version="1.0" encoding="utf-8"?>
+<ds:datastoreItem xmlns:ds="http://schemas.openxmlformats.org/officeDocument/2006/customXml" ds:itemID="{B8E5FF8D-93DF-42F5-8D0C-D6D6D31AB061}">
+  <ds:schemaRefs>
+    <ds:schemaRef ds:uri="http://schemas.microsoft.com/office/2006/metadata/properties"/>
+    <ds:schemaRef ds:uri="http://schemas.microsoft.com/office/infopath/2007/PartnerControls"/>
+    <ds:schemaRef ds:uri="bcce9e69-2193-489b-8979-bcf4d9513be1"/>
+  </ds:schemaRefs>
+</ds:datastoreItem>
 </file>
 
-<file path=customXml/item3.xml><?xml version="1.0" encoding="utf-8"?>
-<?mso-contentType ?>
-<FormTemplates xmlns="http://schemas.microsoft.com/sharepoint/v3/contenttype/forms">
-  <Display>DocumentLibraryForm</Display>
-  <Edit>DocumentLibraryForm</Edit>
-  <New>DocumentLibraryForm</New>
-</FormTemplates>
+<file path=customXml/itemProps2.xml><?xml version="1.0" encoding="utf-8"?>
+<ds:datastoreItem xmlns:ds="http://schemas.openxmlformats.org/officeDocument/2006/customXml" ds:itemID="{4FB0072D-4D86-4287-A28D-140B2D94D6E6}">
+  <ds:schemaRefs>
+    <ds:schemaRef ds:uri="http://schemas.microsoft.com/sharepoint/v3/contenttype/forms"/>
+  </ds:schemaRefs>
+</ds:datastoreItem>
 </file>
 
-<file path=customXml/item4.xml><?xml version="1.0" encoding="utf-8"?>
-<p:properties xmlns:p="http://schemas.microsoft.com/office/2006/metadata/properties" xmlns:xsi="http://www.w3.org/2001/XMLSchema-instance" xmlns:pc="http://schemas.microsoft.com/office/infopath/2007/PartnerControls">
-  <documentManagement>
-    <_activity xmlns="bcce9e69-2193-489b-8979-bcf4d9513be1" xsi:nil="true"/>
-  </documentManagement>
-</p:properties>
+<file path=customXml/itemProps3.xml><?xml version="1.0" encoding="utf-8"?>
+<ds:datastoreItem xmlns:ds="http://schemas.openxmlformats.org/officeDocument/2006/customXml" ds:itemID="{5AF88806-9421-4965-9206-D524E6254C01}">
+  <ds:schemaRefs>
+    <ds:schemaRef ds:uri="http://schemas.openxmlformats.org/officeDocument/2006/bibliography"/>
+  </ds:schemaRefs>
+</ds:datastoreItem>
 </file>
 
-<file path=customXml/itemProps1.xml><?xml version="1.0" encoding="utf-8"?>
+<file path=customXml/itemProps4.xml><?xml version="1.0" encoding="utf-8"?>
 <ds:datastoreItem xmlns:ds="http://schemas.openxmlformats.org/officeDocument/2006/customXml" ds:itemID="{48A79393-5999-4CA9-8AB6-5E47C855988B}">
   <ds:schemaRefs>
     <ds:schemaRef ds:uri="http://schemas.microsoft.com/office/2006/metadata/contentType"/>
@@ -6553,32 +6461,6 @@
 </ds:datastoreItem>
 </file>
 
-<file path=customXml/itemProps2.xml><?xml version="1.0" encoding="utf-8"?>
-<ds:datastoreItem xmlns:ds="http://schemas.openxmlformats.org/officeDocument/2006/customXml" ds:itemID="{5AF88806-9421-4965-9206-D524E6254C01}">
-  <ds:schemaRefs>
-    <ds:schemaRef ds:uri="http://schemas.openxmlformats.org/officeDocument/2006/bibliography"/>
-  </ds:schemaRefs>
-</ds:datastoreItem>
-</file>
-
-<file path=customXml/itemProps3.xml><?xml version="1.0" encoding="utf-8"?>
-<ds:datastoreItem xmlns:ds="http://schemas.openxmlformats.org/officeDocument/2006/customXml" ds:itemID="{4FB0072D-4D86-4287-A28D-140B2D94D6E6}">
-  <ds:schemaRefs>
-    <ds:schemaRef ds:uri="http://schemas.microsoft.com/sharepoint/v3/contenttype/forms"/>
-  </ds:schemaRefs>
-</ds:datastoreItem>
-</file>
-
-<file path=customXml/itemProps4.xml><?xml version="1.0" encoding="utf-8"?>
-<ds:datastoreItem xmlns:ds="http://schemas.openxmlformats.org/officeDocument/2006/customXml" ds:itemID="{B8E5FF8D-93DF-42F5-8D0C-D6D6D31AB061}">
-  <ds:schemaRefs>
-    <ds:schemaRef ds:uri="http://schemas.microsoft.com/office/2006/metadata/properties"/>
-    <ds:schemaRef ds:uri="http://schemas.microsoft.com/office/infopath/2007/PartnerControls"/>
-    <ds:schemaRef ds:uri="bcce9e69-2193-489b-8979-bcf4d9513be1"/>
-  </ds:schemaRefs>
-</ds:datastoreItem>
-</file>
-
 <file path=docMetadata/LabelInfo.xml><?xml version="1.0" encoding="utf-8"?>
 <clbl:labelList xmlns:clbl="http://schemas.microsoft.com/office/2020/mipLabelMetadata">
   <clbl:label id="{98533b19-5b8e-4b87-8bd4-14d058a7d451}" enabled="0" method="" siteId="{98533b19-5b8e-4b87-8bd4-14d058a7d451}" removed="1"/>

</xml_diff>

<commit_message>
Show EN PRESTAMO badge for approved loans in Admin Solicitudes
</commit_message>
<xml_diff>
--- a/public/acta_asigna.docx
+++ b/public/acta_asigna.docx
@@ -2,6 +2,36 @@
 <file path=word/document.xml><?xml version="1.0" encoding="utf-8"?>
 <w:document xmlns:wpc="http://schemas.microsoft.com/office/word/2010/wordprocessingCanvas" xmlns:cx="http://schemas.microsoft.com/office/drawing/2014/chartex" xmlns:cx1="http://schemas.microsoft.com/office/drawing/2015/9/8/chartex" xmlns:cx2="http://schemas.microsoft.com/office/drawing/2015/10/21/chartex" xmlns:cx3="http://schemas.microsoft.com/office/drawing/2016/5/9/chartex" xmlns:cx4="http://schemas.microsoft.com/office/drawing/2016/5/10/chartex" xmlns:cx5="http://schemas.microsoft.com/office/drawing/2016/5/11/chartex" xmlns:cx6="http://schemas.microsoft.com/office/drawing/2016/5/12/chartex" xmlns:cx7="http://schemas.microsoft.com/office/drawing/2016/5/13/chartex" xmlns:cx8="http://schemas.microsoft.com/office/drawing/2016/5/14/chartex" xmlns:mc="http://schemas.openxmlformats.org/markup-compatibility/2006" xmlns:aink="http://schemas.microsoft.com/office/drawing/2016/ink" xmlns:am3d="http://schemas.microsoft.com/office/drawing/2017/model3d" xmlns:o="urn:schemas-microsoft-com:office:office" xmlns:oel="http://schemas.microsoft.com/office/2019/extlst" xmlns:r="http://schemas.openxmlformats.org/officeDocument/2006/relationships" xmlns:m="http://schemas.openxmlformats.org/officeDocument/2006/math" xmlns:v="urn:schemas-microsoft-com:vml" xmlns:wp14="http://schemas.microsoft.com/office/word/2010/wordprocessingDrawing" xmlns:wp="http://schemas.openxmlformats.org/drawingml/2006/wordprocessingDrawing" xmlns:w10="urn:schemas-microsoft-com:office:word" xmlns:w="http://schemas.openxmlformats.org/wordprocessingml/2006/main" xmlns:w14="http://schemas.microsoft.com/office/word/2010/wordml" xmlns:w15="http://schemas.microsoft.com/office/word/2012/wordml" xmlns:w16cex="http://schemas.microsoft.com/office/word/2018/wordml/cex" xmlns:w16cid="http://schemas.microsoft.com/office/word/2016/wordml/cid" xmlns:w16="http://schemas.microsoft.com/office/word/2018/wordml" xmlns:w16du="http://schemas.microsoft.com/office/word/2023/wordml/word16du" xmlns:w16sdtdh="http://schemas.microsoft.com/office/word/2020/wordml/sdtdatahash" xmlns:w16sdtfl="http://schemas.microsoft.com/office/word/2024/wordml/sdtformatlock" xmlns:w16se="http://schemas.microsoft.com/office/word/2015/wordml/symex" xmlns:wpg="http://schemas.microsoft.com/office/word/2010/wordprocessingGroup" xmlns:wpi="http://schemas.microsoft.com/office/word/2010/wordprocessingInk" xmlns:wne="http://schemas.microsoft.com/office/word/2006/wordml" xmlns:wps="http://schemas.microsoft.com/office/word/2010/wordprocessingShape" mc:Ignorable="w14 w15 w16se w16cid w16 w16cex w16sdtdh w16sdtfl w16du wp14">
   <w:body>
+    <w:p>
+      <w:pPr>
+        <w:rPr>
+          <w:rStyle w:val="Normal1"/>
+          <w:rFonts w:ascii="Aptos Display" w:hAnsi="Aptos Display"/>
+          <w:sz w:val="28"/>
+          <w:szCs w:val="28"/>
+        </w:rPr>
+      </w:pPr>
+    </w:p>
+    <w:p>
+      <w:pPr>
+        <w:jc w:val="right"/>
+        <w:rPr>
+          <w:rStyle w:val="Normal1"/>
+          <w:rFonts w:ascii="Aptos Display" w:hAnsi="Aptos Display"/>
+          <w:sz w:val="28"/>
+          <w:szCs w:val="28"/>
+        </w:rPr>
+      </w:pPr>
+      <w:r>
+        <w:rPr>
+          <w:rStyle w:val="Normal1"/>
+          <w:rFonts w:ascii="Aptos Display" w:hAnsi="Aptos Display"/>
+          <w:sz w:val="28"/>
+          <w:szCs w:val="28"/>
+        </w:rPr>
+        <w:t>{día} de {mes} de {año}, Los Angeles</w:t>
+      </w:r>
+    </w:p>
     <w:p>
       <w:pPr>
         <w:rPr>
@@ -5452,6 +5482,7 @@
   <w:style w:type="character" w:default="1" w:styleId="Fuentedeprrafopredeter">
     <w:name w:val="Default Paragraph Font"/>
     <w:uiPriority w:val="1"/>
+    <w:semiHidden/>
     <w:unhideWhenUsed/>
   </w:style>
   <w:style w:type="table" w:default="1" w:styleId="Tablanormal">
@@ -6209,27 +6240,6 @@
 </file>
 
 <file path=customXml/item1.xml><?xml version="1.0" encoding="utf-8"?>
-<p:properties xmlns:p="http://schemas.microsoft.com/office/2006/metadata/properties" xmlns:xsi="http://www.w3.org/2001/XMLSchema-instance" xmlns:pc="http://schemas.microsoft.com/office/infopath/2007/PartnerControls">
-  <documentManagement>
-    <_activity xmlns="bcce9e69-2193-489b-8979-bcf4d9513be1" xsi:nil="true"/>
-  </documentManagement>
-</p:properties>
-</file>
-
-<file path=customXml/item2.xml><?xml version="1.0" encoding="utf-8"?>
-<?mso-contentType ?>
-<FormTemplates xmlns="http://schemas.microsoft.com/sharepoint/v3/contenttype/forms">
-  <Display>DocumentLibraryForm</Display>
-  <Edit>DocumentLibraryForm</Edit>
-  <New>DocumentLibraryForm</New>
-</FormTemplates>
-</file>
-
-<file path=customXml/item3.xml><?xml version="1.0" encoding="utf-8"?>
-<b:Sources xmlns:b="http://schemas.openxmlformats.org/officeDocument/2006/bibliography" xmlns="http://schemas.openxmlformats.org/officeDocument/2006/bibliography" SelectedStyle="\APA.XSL" StyleName="APA"/>
-</file>
-
-<file path=customXml/item4.xml><?xml version="1.0" encoding="utf-8"?>
 <ct:contentTypeSchema xmlns:ct="http://schemas.microsoft.com/office/2006/metadata/contentType" xmlns:ma="http://schemas.microsoft.com/office/2006/metadata/properties/metaAttributes" ct:_="" ma:_="" ma:contentTypeName="Document" ma:contentTypeID="0x010100D2977320FF50BE48B7E8EE87EBCF0601" ma:contentTypeVersion="11" ma:contentTypeDescription="Create a new document." ma:contentTypeScope="" ma:versionID="d3e0c027367d740cbf39034df56ffe22">
   <xsd:schema xmlns:xsd="http://www.w3.org/2001/XMLSchema" xmlns:xs="http://www.w3.org/2001/XMLSchema" xmlns:p="http://schemas.microsoft.com/office/2006/metadata/properties" xmlns:ns3="bcce9e69-2193-489b-8979-bcf4d9513be1" targetNamespace="http://schemas.microsoft.com/office/2006/metadata/properties" ma:root="true" ma:fieldsID="28b1c348ba72a3784f3915424c61e130" ns3:_="">
     <xsd:import namespace="bcce9e69-2193-489b-8979-bcf4d9513be1"/>
@@ -6417,33 +6427,28 @@
 </ct:contentTypeSchema>
 </file>
 
-<file path=customXml/itemProps1.xml><?xml version="1.0" encoding="utf-8"?>
-<ds:datastoreItem xmlns:ds="http://schemas.openxmlformats.org/officeDocument/2006/customXml" ds:itemID="{B8E5FF8D-93DF-42F5-8D0C-D6D6D31AB061}">
-  <ds:schemaRefs>
-    <ds:schemaRef ds:uri="http://schemas.microsoft.com/office/2006/metadata/properties"/>
-    <ds:schemaRef ds:uri="http://schemas.microsoft.com/office/infopath/2007/PartnerControls"/>
-    <ds:schemaRef ds:uri="bcce9e69-2193-489b-8979-bcf4d9513be1"/>
-  </ds:schemaRefs>
-</ds:datastoreItem>
+<file path=customXml/item2.xml><?xml version="1.0" encoding="utf-8"?>
+<b:Sources xmlns:b="http://schemas.openxmlformats.org/officeDocument/2006/bibliography" xmlns="http://schemas.openxmlformats.org/officeDocument/2006/bibliography" SelectedStyle="\APA.XSL" StyleName="APA"/>
 </file>
 
-<file path=customXml/itemProps2.xml><?xml version="1.0" encoding="utf-8"?>
-<ds:datastoreItem xmlns:ds="http://schemas.openxmlformats.org/officeDocument/2006/customXml" ds:itemID="{4FB0072D-4D86-4287-A28D-140B2D94D6E6}">
-  <ds:schemaRefs>
-    <ds:schemaRef ds:uri="http://schemas.microsoft.com/sharepoint/v3/contenttype/forms"/>
-  </ds:schemaRefs>
-</ds:datastoreItem>
+<file path=customXml/item3.xml><?xml version="1.0" encoding="utf-8"?>
+<?mso-contentType ?>
+<FormTemplates xmlns="http://schemas.microsoft.com/sharepoint/v3/contenttype/forms">
+  <Display>DocumentLibraryForm</Display>
+  <Edit>DocumentLibraryForm</Edit>
+  <New>DocumentLibraryForm</New>
+</FormTemplates>
 </file>
 
-<file path=customXml/itemProps3.xml><?xml version="1.0" encoding="utf-8"?>
-<ds:datastoreItem xmlns:ds="http://schemas.openxmlformats.org/officeDocument/2006/customXml" ds:itemID="{5AF88806-9421-4965-9206-D524E6254C01}">
-  <ds:schemaRefs>
-    <ds:schemaRef ds:uri="http://schemas.openxmlformats.org/officeDocument/2006/bibliography"/>
-  </ds:schemaRefs>
-</ds:datastoreItem>
+<file path=customXml/item4.xml><?xml version="1.0" encoding="utf-8"?>
+<p:properties xmlns:p="http://schemas.microsoft.com/office/2006/metadata/properties" xmlns:xsi="http://www.w3.org/2001/XMLSchema-instance" xmlns:pc="http://schemas.microsoft.com/office/infopath/2007/PartnerControls">
+  <documentManagement>
+    <_activity xmlns="bcce9e69-2193-489b-8979-bcf4d9513be1" xsi:nil="true"/>
+  </documentManagement>
+</p:properties>
 </file>
 
-<file path=customXml/itemProps4.xml><?xml version="1.0" encoding="utf-8"?>
+<file path=customXml/itemProps1.xml><?xml version="1.0" encoding="utf-8"?>
 <ds:datastoreItem xmlns:ds="http://schemas.openxmlformats.org/officeDocument/2006/customXml" ds:itemID="{48A79393-5999-4CA9-8AB6-5E47C855988B}">
   <ds:schemaRefs>
     <ds:schemaRef ds:uri="http://schemas.microsoft.com/office/2006/metadata/contentType"/>
@@ -6461,6 +6466,32 @@
 </ds:datastoreItem>
 </file>
 
+<file path=customXml/itemProps2.xml><?xml version="1.0" encoding="utf-8"?>
+<ds:datastoreItem xmlns:ds="http://schemas.openxmlformats.org/officeDocument/2006/customXml" ds:itemID="{5AF88806-9421-4965-9206-D524E6254C01}">
+  <ds:schemaRefs>
+    <ds:schemaRef ds:uri="http://schemas.openxmlformats.org/officeDocument/2006/bibliography"/>
+  </ds:schemaRefs>
+</ds:datastoreItem>
+</file>
+
+<file path=customXml/itemProps3.xml><?xml version="1.0" encoding="utf-8"?>
+<ds:datastoreItem xmlns:ds="http://schemas.openxmlformats.org/officeDocument/2006/customXml" ds:itemID="{4FB0072D-4D86-4287-A28D-140B2D94D6E6}">
+  <ds:schemaRefs>
+    <ds:schemaRef ds:uri="http://schemas.microsoft.com/sharepoint/v3/contenttype/forms"/>
+  </ds:schemaRefs>
+</ds:datastoreItem>
+</file>
+
+<file path=customXml/itemProps4.xml><?xml version="1.0" encoding="utf-8"?>
+<ds:datastoreItem xmlns:ds="http://schemas.openxmlformats.org/officeDocument/2006/customXml" ds:itemID="{B8E5FF8D-93DF-42F5-8D0C-D6D6D31AB061}">
+  <ds:schemaRefs>
+    <ds:schemaRef ds:uri="http://schemas.microsoft.com/office/2006/metadata/properties"/>
+    <ds:schemaRef ds:uri="http://schemas.microsoft.com/office/infopath/2007/PartnerControls"/>
+    <ds:schemaRef ds:uri="bcce9e69-2193-489b-8979-bcf4d9513be1"/>
+  </ds:schemaRefs>
+</ds:datastoreItem>
+</file>
+
 <file path=docMetadata/LabelInfo.xml><?xml version="1.0" encoding="utf-8"?>
 <clbl:labelList xmlns:clbl="http://schemas.microsoft.com/office/2020/mipLabelMetadata">
   <clbl:label id="{98533b19-5b8e-4b87-8bd4-14d058a7d451}" enabled="0" method="" siteId="{98533b19-5b8e-4b87-8bd4-14d058a7d451}" removed="1"/>

</xml_diff>

<commit_message>
Add date prompt for assignment actas with dia, mes, ano
</commit_message>
<xml_diff>
--- a/public/acta_asigna.docx
+++ b/public/acta_asigna.docx
@@ -29,7 +29,16 @@
           <w:sz w:val="28"/>
           <w:szCs w:val="28"/>
         </w:rPr>
-        <w:t>{día} de {mes} de {año}, Los Angeles</w:t>
+        <w:t xml:space="preserve">{día} de {mes} de {año}, Los </w:t>
+      </w:r>
+      <w:r>
+        <w:rPr>
+          <w:rStyle w:val="Normal1"/>
+          <w:rFonts w:ascii="Aptos Display" w:hAnsi="Aptos Display"/>
+          <w:sz w:val="28"/>
+          <w:szCs w:val="28"/>
+        </w:rPr>
+        <w:t>Ángeles</w:t>
       </w:r>
     </w:p>
     <w:p>
@@ -105,7 +114,15 @@
                 <w:rStyle w:val="Normal1"/>
                 <w:rFonts w:ascii="Aptos Display" w:hAnsi="Aptos Display"/>
               </w:rPr>
-              <w:t>{ti_</w:t>
+              <w:t>{</w:t>
+            </w:r>
+            <w:proofErr w:type="spellStart"/>
+            <w:r>
+              <w:rPr>
+                <w:rStyle w:val="Normal1"/>
+                <w:rFonts w:ascii="Aptos Display" w:hAnsi="Aptos Display"/>
+              </w:rPr>
+              <w:t>ti_</w:t>
             </w:r>
             <w:r>
               <w:rPr>
@@ -114,6 +131,7 @@
               </w:rPr>
               <w:t>rut</w:t>
             </w:r>
+            <w:proofErr w:type="spellEnd"/>
             <w:r>
               <w:rPr>
                 <w:rStyle w:val="Normal1"/>
@@ -141,7 +159,23 @@
                 <w:rStyle w:val="Normal1"/>
                 <w:rFonts w:ascii="Aptos Display" w:hAnsi="Aptos Display"/>
               </w:rPr>
-              <w:t>{ti_nombre}</w:t>
+              <w:t>{</w:t>
+            </w:r>
+            <w:proofErr w:type="spellStart"/>
+            <w:r>
+              <w:rPr>
+                <w:rStyle w:val="Normal1"/>
+                <w:rFonts w:ascii="Aptos Display" w:hAnsi="Aptos Display"/>
+              </w:rPr>
+              <w:t>ti_nombre</w:t>
+            </w:r>
+            <w:proofErr w:type="spellEnd"/>
+            <w:r>
+              <w:rPr>
+                <w:rStyle w:val="Normal1"/>
+                <w:rFonts w:ascii="Aptos Display" w:hAnsi="Aptos Display"/>
+              </w:rPr>
+              <w:t>}</w:t>
             </w:r>
           </w:p>
         </w:tc>
@@ -163,7 +197,23 @@
                 <w:rStyle w:val="Normal1"/>
                 <w:rFonts w:ascii="Aptos Display" w:hAnsi="Aptos Display"/>
               </w:rPr>
-              <w:t>{ti_subdireccion}</w:t>
+              <w:t>{</w:t>
+            </w:r>
+            <w:proofErr w:type="spellStart"/>
+            <w:r>
+              <w:rPr>
+                <w:rStyle w:val="Normal1"/>
+                <w:rFonts w:ascii="Aptos Display" w:hAnsi="Aptos Display"/>
+              </w:rPr>
+              <w:t>ti_subdireccion</w:t>
+            </w:r>
+            <w:proofErr w:type="spellEnd"/>
+            <w:r>
+              <w:rPr>
+                <w:rStyle w:val="Normal1"/>
+                <w:rFonts w:ascii="Aptos Display" w:hAnsi="Aptos Display"/>
+              </w:rPr>
+              <w:t>}</w:t>
             </w:r>
           </w:p>
         </w:tc>
@@ -311,7 +361,15 @@
                 <w:rStyle w:val="Normal1"/>
                 <w:rFonts w:ascii="Aptos Display" w:hAnsi="Aptos Display"/>
               </w:rPr>
-              <w:t>{solicitante_</w:t>
+              <w:t>{</w:t>
+            </w:r>
+            <w:proofErr w:type="spellStart"/>
+            <w:r>
+              <w:rPr>
+                <w:rStyle w:val="Normal1"/>
+                <w:rFonts w:ascii="Aptos Display" w:hAnsi="Aptos Display"/>
+              </w:rPr>
+              <w:t>solicitante_</w:t>
             </w:r>
             <w:r>
               <w:rPr>
@@ -320,6 +378,7 @@
               </w:rPr>
               <w:t>rut</w:t>
             </w:r>
+            <w:proofErr w:type="spellEnd"/>
             <w:r>
               <w:rPr>
                 <w:rStyle w:val="Normal1"/>
@@ -347,7 +406,23 @@
                 <w:rStyle w:val="Normal1"/>
                 <w:rFonts w:ascii="Aptos Display" w:hAnsi="Aptos Display"/>
               </w:rPr>
-              <w:t>{solicitante_nombre}</w:t>
+              <w:t>{</w:t>
+            </w:r>
+            <w:proofErr w:type="spellStart"/>
+            <w:r>
+              <w:rPr>
+                <w:rStyle w:val="Normal1"/>
+                <w:rFonts w:ascii="Aptos Display" w:hAnsi="Aptos Display"/>
+              </w:rPr>
+              <w:t>solicitante_nombre</w:t>
+            </w:r>
+            <w:proofErr w:type="spellEnd"/>
+            <w:r>
+              <w:rPr>
+                <w:rStyle w:val="Normal1"/>
+                <w:rFonts w:ascii="Aptos Display" w:hAnsi="Aptos Display"/>
+              </w:rPr>
+              <w:t>}</w:t>
             </w:r>
           </w:p>
         </w:tc>
@@ -369,7 +444,23 @@
                 <w:rStyle w:val="Normal1"/>
                 <w:rFonts w:ascii="Aptos Display" w:hAnsi="Aptos Display"/>
               </w:rPr>
-              <w:t>{solicitante_subdireccion}</w:t>
+              <w:t>{</w:t>
+            </w:r>
+            <w:proofErr w:type="spellStart"/>
+            <w:r>
+              <w:rPr>
+                <w:rStyle w:val="Normal1"/>
+                <w:rFonts w:ascii="Aptos Display" w:hAnsi="Aptos Display"/>
+              </w:rPr>
+              <w:t>solicitante_subdireccion</w:t>
+            </w:r>
+            <w:proofErr w:type="spellEnd"/>
+            <w:r>
+              <w:rPr>
+                <w:rStyle w:val="Normal1"/>
+                <w:rFonts w:ascii="Aptos Display" w:hAnsi="Aptos Display"/>
+              </w:rPr>
+              <w:t>}</w:t>
             </w:r>
           </w:p>
         </w:tc>
@@ -570,12 +661,21 @@
                 <w:rFonts w:ascii="Aptos Display" w:hAnsi="Aptos Display"/>
               </w:rPr>
             </w:pPr>
+            <w:proofErr w:type="spellStart"/>
             <w:r>
               <w:rPr>
                 <w:rStyle w:val="Normal1"/>
                 <w:rFonts w:ascii="Aptos Display" w:hAnsi="Aptos Display"/>
               </w:rPr>
-              <w:t>N° de serie</w:t>
+              <w:t>N°</w:t>
+            </w:r>
+            <w:proofErr w:type="spellEnd"/>
+            <w:r>
+              <w:rPr>
+                <w:rStyle w:val="Normal1"/>
+                <w:rFonts w:ascii="Aptos Display" w:hAnsi="Aptos Display"/>
+              </w:rPr>
+              <w:t xml:space="preserve"> de serie</w:t>
             </w:r>
           </w:p>
         </w:tc>
@@ -598,7 +698,23 @@
                 <w:rStyle w:val="Normal1"/>
                 <w:rFonts w:ascii="Aptos Display" w:hAnsi="Aptos Display"/>
               </w:rPr>
-              <w:t>{#equipos}{tipo}</w:t>
+              <w:t>{#</w:t>
+            </w:r>
+            <w:proofErr w:type="gramStart"/>
+            <w:r>
+              <w:rPr>
+                <w:rStyle w:val="Normal1"/>
+                <w:rFonts w:ascii="Aptos Display" w:hAnsi="Aptos Display"/>
+              </w:rPr>
+              <w:t>equipos}{</w:t>
+            </w:r>
+            <w:proofErr w:type="gramEnd"/>
+            <w:r>
+              <w:rPr>
+                <w:rStyle w:val="Normal1"/>
+                <w:rFonts w:ascii="Aptos Display" w:hAnsi="Aptos Display"/>
+              </w:rPr>
+              <w:t>tipo}</w:t>
             </w:r>
           </w:p>
         </w:tc>
@@ -619,7 +735,23 @@
                 <w:rStyle w:val="Normal1"/>
                 <w:rFonts w:ascii="Aptos Display" w:hAnsi="Aptos Display"/>
               </w:rPr>
-              <w:t>{marca_modelo}</w:t>
+              <w:t>{</w:t>
+            </w:r>
+            <w:proofErr w:type="spellStart"/>
+            <w:r>
+              <w:rPr>
+                <w:rStyle w:val="Normal1"/>
+                <w:rFonts w:ascii="Aptos Display" w:hAnsi="Aptos Display"/>
+              </w:rPr>
+              <w:t>marca_modelo</w:t>
+            </w:r>
+            <w:proofErr w:type="spellEnd"/>
+            <w:r>
+              <w:rPr>
+                <w:rStyle w:val="Normal1"/>
+                <w:rFonts w:ascii="Aptos Display" w:hAnsi="Aptos Display"/>
+              </w:rPr>
+              <w:t>}</w:t>
             </w:r>
           </w:p>
         </w:tc>

</xml_diff>